<commit_message>
feat: 12 artist portraits; perf: fixed-layer night-sky bg + viewport-gated parallax; responsive mobile polish
</commit_message>
<xml_diff>
--- a/MSR_Stan_Projektu_v2026-06-06.docx
+++ b/MSR_Stan_Projektu_v2026-06-06.docx
@@ -46,6 +46,14 @@
       </w:pPr>
       <w:r>
         <w:t xml:space="preserve">Strona główna ma nowy, zapętlony bezszwowo film Hero (nocne niebo z kwiatami i świecącą księgą), dopieszczoną, czytelną typografię oraz prawdziwe logo marki w pasku nawigacji. Sekcje Stories i Authors dzielą teraz ten sam, spójny język wizualny: tło nocnego nieba + ciemne karty liquid-glass. tsc i eslint są czyste.</w:t>
+      </w:r>
+    </w:p>
+    <w:p>
+      <w:pPr>
+        <w:spacing w:after="120"/>
+      </w:pPr>
+      <w:r>
+        <w:t xml:space="preserve">Layout jest zoptymalizowany pod telefony i tablety (parallax tła tylko na desktopie, wysokość Hero w svh, responsywny nadtytuł).</w:t>
       </w:r>
     </w:p>
     <w:p>
@@ -1441,6 +1449,114 @@
         <w:pStyle w:val="Heading1"/>
       </w:pPr>
       <w:r>
+        <w:t xml:space="preserve">Responsywność (telefony / tablety)</w:t>
+      </w:r>
+    </w:p>
+    <w:p>
+      <w:pPr>
+        <w:pStyle w:val="ListParagraph"/>
+        <w:numPr>
+          <w:ilvl w:val="0"/>
+          <w:numId w:val="2"/>
+        </w:numPr>
+        <w:spacing w:after="40"/>
+      </w:pPr>
+      <w:r>
+        <w:rPr>
+          <w:b/>
+          <w:bCs/>
+        </w:rPr>
+        <w:t xml:space="preserve">Tła nocnego nieba (Stories, Authors): </w:t>
+      </w:r>
+      <w:r>
+        <w:t xml:space="preserve">bg-fixed → „bg-scroll md:bg-fixed”. iOS Safari ignoruje background-attachment: fixed (jank/tnie wydajność); parallax zostaje tylko na ≥ md.</w:t>
+      </w:r>
+    </w:p>
+    <w:p>
+      <w:pPr>
+        <w:pStyle w:val="ListParagraph"/>
+        <w:numPr>
+          <w:ilvl w:val="0"/>
+          <w:numId w:val="2"/>
+        </w:numPr>
+        <w:spacing w:after="40"/>
+      </w:pPr>
+      <w:r>
+        <w:rPr>
+          <w:b/>
+          <w:bCs/>
+        </w:rPr>
+        <w:t xml:space="preserve">Hero — wysokość: </w:t>
+      </w:r>
+      <w:r>
+        <w:t xml:space="preserve">min-h-screen → min-h-[100svh], żeby pasek przeglądarki na telefonie nie chował CTA „Enter the Story”.</w:t>
+      </w:r>
+    </w:p>
+    <w:p>
+      <w:pPr>
+        <w:pStyle w:val="ListParagraph"/>
+        <w:numPr>
+          <w:ilvl w:val="0"/>
+          <w:numId w:val="2"/>
+        </w:numPr>
+        <w:spacing w:after="40"/>
+      </w:pPr>
+      <w:r>
+        <w:rPr>
+          <w:b/>
+          <w:bCs/>
+        </w:rPr>
+        <w:t xml:space="preserve">Nadtytuł w Hero: </w:t>
+      </w:r>
+      <w:r>
+        <w:t xml:space="preserve">responsywny — mniejsza czcionka i ciaśniejszy tracking + krótsze złote kreski na telefonie (text-[0.62rem]/0.2em), skalowane od sm. Wcześniej przepełniał się na ~360 px.</w:t>
+      </w:r>
+    </w:p>
+    <w:p>
+      <w:pPr>
+        <w:pStyle w:val="ListParagraph"/>
+        <w:numPr>
+          <w:ilvl w:val="0"/>
+          <w:numId w:val="2"/>
+        </w:numPr>
+        <w:spacing w:after="40"/>
+      </w:pPr>
+      <w:r>
+        <w:rPr>
+          <w:b/>
+          <w:bCs/>
+        </w:rPr>
+        <w:t xml:space="preserve">Już wcześniej OK: </w:t>
+      </w:r>
+      <w:r>
+        <w:t xml:space="preserve">menu hamburgerowe &lt; md z pełnoekranowym panelem; siatki 1 kol. telefon / 2 tablet / 3 desktop; dotykowe cele 44 px; brak poziomego przewijania (zweryfikowane).</w:t>
+      </w:r>
+    </w:p>
+    <w:p>
+      <w:pPr>
+        <w:pStyle w:val="ListParagraph"/>
+        <w:numPr>
+          <w:ilvl w:val="0"/>
+          <w:numId w:val="2"/>
+        </w:numPr>
+        <w:spacing w:after="40"/>
+      </w:pPr>
+      <w:r>
+        <w:rPr>
+          <w:b/>
+          <w:bCs/>
+        </w:rPr>
+        <w:t xml:space="preserve">Uwaga: </w:t>
+      </w:r>
+      <w:r>
+        <w:t xml:space="preserve">okno przeglądarki w sandboxie nie schodzi poniżej szerokości monitora — audyt zrobiony z kodu; zweryfikować wizualnie na realnym telefonie lub w trybie urządzenia DevTools.</w:t>
+      </w:r>
+    </w:p>
+    <w:p>
+      <w:pPr>
+        <w:pStyle w:val="Heading1"/>
+      </w:pPr>
+      <w:r>
         <w:t xml:space="preserve">Pułapki tego środowiska (ważne!)</w:t>
       </w:r>
     </w:p>
@@ -1777,7 +1893,7 @@
         <w:rPr>
           <w:rFonts w:ascii="Consolas" w:cs="Consolas" w:eastAsia="Consolas" w:hAnsi="Consolas"/>
         </w:rPr>
-        <w:t xml:space="preserve">git commit -m "feat(home): new seamless hero loop, real brand logo in nav; stories night-sky glass; authors cutout portraits"</w:t>
+        <w:t xml:space="preserve">git commit -m "feat(home): seamless hero loop, real brand logo in nav; stories night-sky glass; authors cutout portraits; responsive mobile/tablet polish"</w:t>
       </w:r>
     </w:p>
     <w:p>

</xml_diff>

<commit_message>
feat(library): rename Campfire -> Magic Library (/library); Browse Releases CTA; community feed (auth, profiles, posts, likes, replies, edit/delete); authors platform links
</commit_message>
<xml_diff>
--- a/MSR_Stan_Projektu_v2026-06-06.docx
+++ b/MSR_Stan_Projektu_v2026-06-06.docx
@@ -53,7 +53,7 @@
         <w:spacing w:after="120"/>
       </w:pPr>
       <w:r>
-        <w:t xml:space="preserve">Layout jest zoptymalizowany pod telefony i tablety (parallax tła tylko na desktopie, wysokość Hero w svh, responsywny nadtytuł).</w:t>
+        <w:t xml:space="preserve">Wszystkich 12 artystów ma już portrety (przezroczyste wycinanki). Layout jest zoptymalizowany pod telefony i tablety, a sekcje z nocnym niebem (Hero, Stories, Authors) przewijają się płynnie.</w:t>
       </w:r>
     </w:p>
     <w:p>
@@ -61,7 +61,15 @@
         <w:spacing w:after="120"/>
       </w:pPr>
       <w:r>
-        <w:t xml:space="preserve">Niezacommitowane: cała ta sesja czeka na push (w sandboxie git jest zablokowany — komendy do uruchomienia z PowerShella są na końcu). Otwarty temat: portrety artystów oraz pozytywowa wersja logo na jasne tła.</w:t>
+        <w:t xml:space="preserve">Strona jest wdrożona na Vercel: https://magic-stories-three.vercel.app/ — deploy odpala się automatycznie po każdym git push na main (build ~1–2 min).</w:t>
+      </w:r>
+    </w:p>
+    <w:p>
+      <w:pPr>
+        <w:spacing w:after="120"/>
+      </w:pPr>
+      <w:r>
+        <w:t xml:space="preserve">Otwarte tematy: prawdziwe linki do platform oraz pozytywowa wersja logo na jasne tła. W sandboxie git jest zablokowany — commit/push z PowerShella (komendy na końcu).</w:t>
       </w:r>
     </w:p>
     <w:p>
@@ -1557,6 +1565,150 @@
         <w:pStyle w:val="Heading1"/>
       </w:pPr>
       <w:r>
+        <w:t xml:space="preserve">Portrety i naprawy mobilne (druga część sesji)</w:t>
+      </w:r>
+    </w:p>
+    <w:p>
+      <w:pPr>
+        <w:pStyle w:val="Heading2"/>
+      </w:pPr>
+      <w:r>
+        <w:t xml:space="preserve">Portrety artystów</w:t>
+      </w:r>
+    </w:p>
+    <w:p>
+      <w:pPr>
+        <w:pStyle w:val="ListParagraph"/>
+        <w:numPr>
+          <w:ilvl w:val="0"/>
+          <w:numId w:val="2"/>
+        </w:numPr>
+        <w:spacing w:after="40"/>
+      </w:pPr>
+      <w:r>
+        <w:rPr>
+          <w:b/>
+          <w:bCs/>
+        </w:rPr>
+        <w:t xml:space="preserve">Wszystkie 12 portretów wpięte </w:t>
+      </w:r>
+      <w:r>
+        <w:t xml:space="preserve">z public/images/artists/. To przezroczyste wycinanki (~1229×864), więc każdy ma cutout: true → object-contain na szkle, bez ciemnego panelu.</w:t>
+      </w:r>
+    </w:p>
+    <w:p>
+      <w:pPr>
+        <w:pStyle w:val="ListParagraph"/>
+        <w:numPr>
+          <w:ilvl w:val="0"/>
+          <w:numId w:val="2"/>
+        </w:numPr>
+        <w:spacing w:after="40"/>
+      </w:pPr>
+      <w:r>
+        <w:rPr>
+          <w:b/>
+          <w:bCs/>
+        </w:rPr>
+        <w:t xml:space="preserve">Nazwy plików ≠ slug: </w:t>
+      </w:r>
+      <w:r>
+        <w:t xml:space="preserve">dj-mazze, dj-miqro, dj-peres, dj-slaqk, dj-enigmatic, rafa-el — ścieżki portrait wskazują realne nazwy. Osierocony mazze.jpg do usunięcia.</w:t>
+      </w:r>
+    </w:p>
+    <w:p>
+      <w:pPr>
+        <w:pStyle w:val="Heading2"/>
+      </w:pPr>
+      <w:r>
+        <w:t xml:space="preserve">Naprawy mobilne / wydajność</w:t>
+      </w:r>
+    </w:p>
+    <w:p>
+      <w:pPr>
+        <w:pStyle w:val="ListParagraph"/>
+        <w:numPr>
+          <w:ilvl w:val="0"/>
+          <w:numId w:val="2"/>
+        </w:numPr>
+        <w:spacing w:after="40"/>
+      </w:pPr>
+      <w:r>
+        <w:rPr>
+          <w:b/>
+          <w:bCs/>
+        </w:rPr>
+        <w:t xml:space="preserve">Tło → warstwa position: fixed </w:t>
+      </w:r>
+      <w:r>
+        <w:t xml:space="preserve">(zamiast background-attachment: fixed). Ostre (rozmiar viewportu) i płynne (warstwa GPU), bez janku i pikselozy; działa też na iOS.</w:t>
+      </w:r>
+    </w:p>
+    <w:p>
+      <w:pPr>
+        <w:pStyle w:val="ListParagraph"/>
+        <w:numPr>
+          <w:ilvl w:val="0"/>
+          <w:numId w:val="2"/>
+        </w:numPr>
+        <w:spacing w:after="40"/>
+      </w:pPr>
+      <w:r>
+        <w:rPr>
+          <w:b/>
+          <w:bCs/>
+        </w:rPr>
+        <w:t xml:space="preserve">Parallax tylko desktop (≥768 px): </w:t>
+      </w:r>
+      <w:r>
+        <w:t xml:space="preserve">na telefonie był wyłączony i resetuje transformację — wcześniej przesuwał i „rozjeżdżał” portrety przy scrollu. Liczy się tylko dla elementów w viewporcie (IntersectionObserver).</w:t>
+      </w:r>
+    </w:p>
+    <w:p>
+      <w:pPr>
+        <w:pStyle w:val="ListParagraph"/>
+        <w:numPr>
+          <w:ilvl w:val="0"/>
+          <w:numId w:val="2"/>
+        </w:numPr>
+        <w:spacing w:after="40"/>
+      </w:pPr>
+      <w:r>
+        <w:rPr>
+          <w:b/>
+          <w:bCs/>
+        </w:rPr>
+        <w:t xml:space="preserve">Menu mobilne — krytyczny fix: </w:t>
+      </w:r>
+      <w:r>
+        <w:t xml:space="preserve">panel wyjęto z &lt;header&gt;. Pasek na ciemnych stronach ma backdrop-blur, a element z backdrop-filter staje się containing block dla position: fixed potomków — przez to panel zakrywał tylko box paska, a linki ginęły. Teraz panel jest rodzeństwem paska (fixed względem viewportu).</w:t>
+      </w:r>
+    </w:p>
+    <w:p>
+      <w:pPr>
+        <w:pStyle w:val="ListParagraph"/>
+        <w:numPr>
+          <w:ilvl w:val="0"/>
+          <w:numId w:val="2"/>
+        </w:numPr>
+        <w:spacing w:after="40"/>
+      </w:pPr>
+      <w:r>
+        <w:rPr>
+          <w:b/>
+          <w:bCs/>
+        </w:rPr>
+        <w:t xml:space="preserve">Wysokość kart Authors: </w:t>
+      </w:r>
+      <w:r>
+        <w:t xml:space="preserve">kontener portretu na mobile dostał aspect-[3/2] dla wycinanek (zamiast 4/5) — koniec dużego pustego miejsca nad postacią.</w:t>
+      </w:r>
+    </w:p>
+    <w:p>
+      <w:pPr>
+        <w:pStyle w:val="Heading1"/>
+      </w:pPr>
+      <w:r>
         <w:t xml:space="preserve">Pułapki tego środowiska (ważne!)</w:t>
       </w:r>
     </w:p>
@@ -1674,6 +1826,26 @@
           <w:b/>
           <w:bCs/>
         </w:rPr>
+        <w:t xml:space="preserve">backdrop-filter = containing block: </w:t>
+      </w:r>
+      <w:r>
+        <w:t xml:space="preserve">element z backdrop-filter/filter/transform „łapie” position: fixed potomków do swojego boxu. Mobilny panel menu musi być POZA paskiem z blurem.</w:t>
+      </w:r>
+    </w:p>
+    <w:p>
+      <w:pPr>
+        <w:pStyle w:val="ListParagraph"/>
+        <w:numPr>
+          <w:ilvl w:val="0"/>
+          <w:numId w:val="2"/>
+        </w:numPr>
+        <w:spacing w:after="40"/>
+      </w:pPr>
+      <w:r>
+        <w:rPr>
+          <w:b/>
+          <w:bCs/>
+        </w:rPr>
         <w:t xml:space="preserve">Uploady obrazów: </w:t>
       </w:r>
       <w:r>
@@ -1722,10 +1894,10 @@
           <w:b/>
           <w:bCs/>
         </w:rPr>
-        <w:t xml:space="preserve">PRIORYTET — portrety artystów: </w:t>
-      </w:r>
-      <w:r>
-        <w:t xml:space="preserve">slaqk, peres, mauro-masi, rafael, manu-amon, adria-falco, our-spaces, miqro, robyn-balliet, enigmatic. Czysty portret /public/images/artists/&lt;slug&gt;.jpg; po dodaniu wpisać ścieżkę w polu portrait. Dla wycinanek PNG ustawić cutout: true.</w:t>
+        <w:t xml:space="preserve">Prawdziwe linki platform: </w:t>
+      </w:r>
+      <w:r>
+        <w:t xml:space="preserve">Beatport (ID w tabeli) + Spotify/SoundCloud/Instagram — teraz wszystkie to „#”.</w:t>
       </w:r>
     </w:p>
     <w:p>
@@ -1762,10 +1934,10 @@
           <w:b/>
           <w:bCs/>
         </w:rPr>
-        <w:t xml:space="preserve">Prawdziwe linki platform </w:t>
-      </w:r>
-      <w:r>
-        <w:t xml:space="preserve">(Beatport z tabeli + Spotify/SoundCloud/Instagram).</w:t>
+        <w:t xml:space="preserve">Sprzątanie nieużywanych plików: </w:t>
+      </w:r>
+      <w:r>
+        <w:t xml:space="preserve">public/images/artists/mazze.jpg (osierocony), stare hero-*.mp4 (zostaje v4), logo-msr.png, src/components/Logo.tsx.</w:t>
       </w:r>
     </w:p>
     <w:p>
@@ -1782,10 +1954,10 @@
           <w:b/>
           <w:bCs/>
         </w:rPr>
-        <w:t xml:space="preserve">Sprzątanie: </w:t>
-      </w:r>
-      <w:r>
-        <w:t xml:space="preserve">usunąć nieużywane hero-*.mp4 (zostawić v4), logo-msr.png, Logo.tsx.</w:t>
+        <w:t xml:space="preserve">Weryfikacja na telefonie </w:t>
+      </w:r>
+      <w:r>
+        <w:t xml:space="preserve">po deployu: menu w Authors/Stories (pozycje widoczne), brak przesuwania portretów, płynność scrolla.</w:t>
       </w:r>
     </w:p>
     <w:p>
@@ -1805,7 +1977,7 @@
         <w:t xml:space="preserve">Dalej: </w:t>
       </w:r>
       <w:r>
-        <w:t xml:space="preserve">dwujęzyczność EN/PL; kolejne sekcje (Sessions, Submit); stopka z pełnym lockiem logo.</w:t>
+        <w:t xml:space="preserve">dwujęzyczność EN/PL; sekcje Sessions i Submit; stopka z pełnym lockiem logo (logo-full.svg).</w:t>
       </w:r>
     </w:p>
     <w:p>
@@ -1893,7 +2065,7 @@
         <w:rPr>
           <w:rFonts w:ascii="Consolas" w:cs="Consolas" w:eastAsia="Consolas" w:hAnsi="Consolas"/>
         </w:rPr>
-        <w:t xml:space="preserve">git commit -m "feat(home): seamless hero loop, real brand logo in nav; stories night-sky glass; authors cutout portraits; responsive mobile/tablet polish"</w:t>
+        <w:t xml:space="preserve">git commit -m "fix(mobile): nav sheet out of blurred header; disable parallax on phones; tighter portrait aspect; perf: fixed-layer sky bg"</w:t>
       </w:r>
     </w:p>
     <w:p>

</xml_diff>